<commit_message>
Finalise owner-approved Master Q&A sales draft
Replit-Task-Id: 3bfb891b-dd33-4af2-8f0b-4f861dfbf079
Replit-Merge-Attempt: MergeTask:3bfb891b-dd33-4af2-8f0b-4f861dfbf079:1:db0442f4
</commit_message>
<xml_diff>
--- a/deliverables/aio-fusion-qa-v1.5/AIO-Fusion-Master-QA-v1.5-INTERNAL-REVIEW-DO-NOT-SHARE.docx
+++ b/deliverables/aio-fusion-qa-v1.5/AIO-Fusion-Master-QA-v1.5-INTERNAL-REVIEW-DO-NOT-SHARE.docx
@@ -39,6 +39,435 @@
       <w:r>
         <w:t>The comparison covers 51 source questions or content blocks across all ten sections, including the boilerplate, explanatory subsections and unheaded Market Intelligence paragraph. Full visible source wording is reproduced by block, followed by the exact v1.5 replacement and rationale. Source quotations retain original punctuation, including any original em dashes; new copy does not use em dashes.</w:t>
       </w:r>
+    </w:p>
+    <w:p>
+      <w:pPr>
+        <w:pStyle w:val="Heading1"/>
+      </w:pPr>
+      <w:r>
+        <w:t>Owner decisions recorded 18 September 2026</w:t>
+      </w:r>
+    </w:p>
+    <w:tbl>
+      <w:tblPr>
+        <w:tblStyle w:val="TableGrid"/>
+        <w:tblW w:type="auto" w:w="0"/>
+        <w:jc w:val="center"/>
+        <w:tblLayout w:type="fixed"/>
+        <w:tblLook w:firstColumn="1" w:firstRow="1" w:lastColumn="0" w:lastRow="0" w:noHBand="0" w:noVBand="1" w:val="04A0"/>
+      </w:tblPr>
+      <w:tblGrid>
+        <w:gridCol w:w="3221"/>
+        <w:gridCol w:w="3221"/>
+        <w:gridCol w:w="3221"/>
+      </w:tblGrid>
+      <w:tr>
+        <w:trPr>
+          <w:tblHeader/>
+          <w:cantSplit/>
+        </w:trPr>
+        <w:tc>
+          <w:tcPr>
+            <w:tcW w:type="dxa" w:w="3221"/>
+            <w:shd w:fill="18384B"/>
+            <w:vAlign w:val="center"/>
+          </w:tcPr>
+          <w:p>
+            <w:pPr>
+              <w:spacing w:after="100" w:before="100"/>
+            </w:pPr>
+            <w:r>
+              <w:rPr>
+                <w:b/>
+                <w:color w:val="FFFFFF"/>
+                <w:sz w:val="19"/>
+              </w:rPr>
+              <w:t>Area</w:t>
+            </w:r>
+          </w:p>
+        </w:tc>
+        <w:tc>
+          <w:tcPr>
+            <w:tcW w:type="dxa" w:w="3221"/>
+            <w:shd w:fill="18384B"/>
+            <w:vAlign w:val="center"/>
+          </w:tcPr>
+          <w:p>
+            <w:pPr>
+              <w:spacing w:after="100" w:before="100"/>
+            </w:pPr>
+            <w:r>
+              <w:rPr>
+                <w:b/>
+                <w:color w:val="FFFFFF"/>
+                <w:sz w:val="19"/>
+              </w:rPr>
+              <w:t>Decision</w:t>
+            </w:r>
+          </w:p>
+        </w:tc>
+        <w:tc>
+          <w:tcPr>
+            <w:tcW w:type="dxa" w:w="3221"/>
+            <w:shd w:fill="18384B"/>
+            <w:vAlign w:val="center"/>
+          </w:tcPr>
+          <w:p>
+            <w:pPr>
+              <w:spacing w:after="100" w:before="100"/>
+            </w:pPr>
+            <w:r>
+              <w:rPr>
+                <w:b/>
+                <w:color w:val="FFFFFF"/>
+                <w:sz w:val="19"/>
+              </w:rPr>
+              <w:t>Remaining limitation</w:t>
+            </w:r>
+          </w:p>
+        </w:tc>
+      </w:tr>
+      <w:tr>
+        <w:trPr>
+          <w:cantSplit/>
+        </w:trPr>
+        <w:tc>
+          <w:tcPr>
+            <w:tcW w:type="dxa" w:w="3221"/>
+            <w:vAlign w:val="center"/>
+          </w:tcPr>
+          <w:p>
+            <w:pPr>
+              <w:spacing w:after="100" w:before="100"/>
+            </w:pPr>
+            <w:r>
+              <w:rPr>
+                <w:sz w:val="19"/>
+              </w:rPr>
+              <w:t>Pricing</w:t>
+            </w:r>
+          </w:p>
+        </w:tc>
+        <w:tc>
+          <w:tcPr>
+            <w:tcW w:type="dxa" w:w="3221"/>
+            <w:vAlign w:val="center"/>
+          </w:tcPr>
+          <w:p>
+            <w:pPr>
+              <w:spacing w:after="100" w:before="100"/>
+            </w:pPr>
+            <w:r>
+              <w:rPr>
+                <w:sz w:val="19"/>
+              </w:rPr>
+              <w:t>Spencer Gallagher approved the published figures as indicative beta pricing.</w:t>
+            </w:r>
+          </w:p>
+        </w:tc>
+        <w:tc>
+          <w:tcPr>
+            <w:tcW w:type="dxa" w:w="3221"/>
+            <w:vAlign w:val="center"/>
+          </w:tcPr>
+          <w:p>
+            <w:pPr>
+              <w:spacing w:after="100" w:before="100"/>
+            </w:pPr>
+            <w:r>
+              <w:rPr>
+                <w:sz w:val="19"/>
+              </w:rPr>
+              <w:t>Action-counting, support, extra charges and order terms remain subject to the agreed order.</w:t>
+            </w:r>
+          </w:p>
+        </w:tc>
+      </w:tr>
+      <w:tr>
+        <w:trPr>
+          <w:cantSplit/>
+        </w:trPr>
+        <w:tc>
+          <w:tcPr>
+            <w:tcW w:type="dxa" w:w="3221"/>
+            <w:vAlign w:val="center"/>
+          </w:tcPr>
+          <w:p>
+            <w:pPr>
+              <w:spacing w:after="100" w:before="100"/>
+            </w:pPr>
+            <w:r>
+              <w:rPr>
+                <w:sz w:val="19"/>
+              </w:rPr>
+              <w:t>Beta</w:t>
+            </w:r>
+          </w:p>
+        </w:tc>
+        <w:tc>
+          <w:tcPr>
+            <w:tcW w:type="dxa" w:w="3221"/>
+            <w:vAlign w:val="center"/>
+          </w:tcPr>
+          <w:p>
+            <w:pPr>
+              <w:spacing w:after="100" w:before="100"/>
+            </w:pPr>
+            <w:r>
+              <w:rPr>
+                <w:sz w:val="19"/>
+              </w:rPr>
+              <w:t>Approved a 60-day free trial with structured feedback. Customers who proceed pay each bill in full and receive a 30% refund on each payment during the first 12 months. Refund cadence follows payment cadence.</w:t>
+            </w:r>
+          </w:p>
+        </w:tc>
+        <w:tc>
+          <w:tcPr>
+            <w:tcW w:type="dxa" w:w="3221"/>
+            <w:vAlign w:val="center"/>
+          </w:tcPr>
+          <w:p>
+            <w:pPr>
+              <w:spacing w:after="100" w:before="100"/>
+            </w:pPr>
+            <w:r>
+              <w:rPr>
+                <w:sz w:val="19"/>
+              </w:rPr>
+              <w:t>Trial start trigger, refund processing time, tax, additional-project treatment, cancellation and renewal remain unconfirmed.</w:t>
+            </w:r>
+          </w:p>
+        </w:tc>
+      </w:tr>
+      <w:tr>
+        <w:trPr>
+          <w:cantSplit/>
+        </w:trPr>
+        <w:tc>
+          <w:tcPr>
+            <w:tcW w:type="dxa" w:w="3221"/>
+            <w:vAlign w:val="center"/>
+          </w:tcPr>
+          <w:p>
+            <w:pPr>
+              <w:spacing w:after="100" w:before="100"/>
+            </w:pPr>
+            <w:r>
+              <w:rPr>
+                <w:sz w:val="19"/>
+              </w:rPr>
+              <w:t>Measurement</w:t>
+            </w:r>
+          </w:p>
+        </w:tc>
+        <w:tc>
+          <w:tcPr>
+            <w:tcW w:type="dxa" w:w="3221"/>
+            <w:vAlign w:val="center"/>
+          </w:tcPr>
+          <w:p>
+            <w:pPr>
+              <w:spacing w:after="100" w:before="100"/>
+            </w:pPr>
+            <w:r>
+              <w:rPr>
+                <w:sz w:val="19"/>
+              </w:rPr>
+              <w:t>Approved the qualified disclosures and omission of unsupported blindness, influence and repeatability claims.</w:t>
+            </w:r>
+          </w:p>
+        </w:tc>
+        <w:tc>
+          <w:tcPr>
+            <w:tcW w:type="dxa" w:w="3221"/>
+            <w:vAlign w:val="center"/>
+          </w:tcPr>
+          <w:p>
+            <w:pPr>
+              <w:spacing w:after="100" w:before="100"/>
+            </w:pPr>
+            <w:r>
+              <w:rPr>
+                <w:sz w:val="19"/>
+              </w:rPr>
+              <w:t>Detailed prompts, sampling, scoring and repeatability evidence remain unverified.</w:t>
+            </w:r>
+          </w:p>
+        </w:tc>
+      </w:tr>
+      <w:tr>
+        <w:trPr>
+          <w:cantSplit/>
+        </w:trPr>
+        <w:tc>
+          <w:tcPr>
+            <w:tcW w:type="dxa" w:w="3221"/>
+            <w:vAlign w:val="center"/>
+          </w:tcPr>
+          <w:p>
+            <w:pPr>
+              <w:spacing w:after="100" w:before="100"/>
+            </w:pPr>
+            <w:r>
+              <w:rPr>
+                <w:sz w:val="19"/>
+              </w:rPr>
+              <w:t>Live features</w:t>
+            </w:r>
+          </w:p>
+        </w:tc>
+        <w:tc>
+          <w:tcPr>
+            <w:tcW w:type="dxa" w:w="3221"/>
+            <w:vAlign w:val="center"/>
+          </w:tcPr>
+          <w:p>
+            <w:pPr>
+              <w:spacing w:after="100" w:before="100"/>
+            </w:pPr>
+            <w:r>
+              <w:rPr>
+                <w:sz w:val="19"/>
+              </w:rPr>
+              <w:t>Approved the clean descriptions and explicit current-feature limits.</w:t>
+            </w:r>
+          </w:p>
+        </w:tc>
+        <w:tc>
+          <w:tcPr>
+            <w:tcW w:type="dxa" w:w="3221"/>
+            <w:vAlign w:val="center"/>
+          </w:tcPr>
+          <w:p>
+            <w:pPr>
+              <w:spacing w:after="100" w:before="100"/>
+            </w:pPr>
+            <w:r>
+              <w:rPr>
+                <w:sz w:val="19"/>
+              </w:rPr>
+              <w:t>Owner confirmation was not independently tested; do not add staging-only features.</w:t>
+            </w:r>
+          </w:p>
+        </w:tc>
+      </w:tr>
+      <w:tr>
+        <w:trPr>
+          <w:cantSplit/>
+        </w:trPr>
+        <w:tc>
+          <w:tcPr>
+            <w:tcW w:type="dxa" w:w="3221"/>
+            <w:vAlign w:val="center"/>
+          </w:tcPr>
+          <w:p>
+            <w:pPr>
+              <w:spacing w:after="100" w:before="100"/>
+            </w:pPr>
+            <w:r>
+              <w:rPr>
+                <w:sz w:val="19"/>
+              </w:rPr>
+              <w:t>Procurement</w:t>
+            </w:r>
+          </w:p>
+        </w:tc>
+        <w:tc>
+          <w:tcPr>
+            <w:tcW w:type="dxa" w:w="3221"/>
+            <w:vAlign w:val="center"/>
+          </w:tcPr>
+          <w:p>
+            <w:pPr>
+              <w:spacing w:after="100" w:before="100"/>
+            </w:pPr>
+            <w:r>
+              <w:rPr>
+                <w:sz w:val="19"/>
+              </w:rPr>
+              <w:t>No approval recorded.</w:t>
+            </w:r>
+          </w:p>
+        </w:tc>
+        <w:tc>
+          <w:tcPr>
+            <w:tcW w:type="dxa" w:w="3221"/>
+            <w:vAlign w:val="center"/>
+          </w:tcPr>
+          <w:p>
+            <w:pPr>
+              <w:spacing w:after="100" w:before="100"/>
+            </w:pPr>
+            <w:r>
+              <w:rPr>
+                <w:sz w:val="19"/>
+              </w:rPr>
+              <w:t>Keep the explicit security, privacy, processor, location, retention and certification limitations.</w:t>
+            </w:r>
+          </w:p>
+        </w:tc>
+      </w:tr>
+      <w:tr>
+        <w:trPr>
+          <w:cantSplit/>
+        </w:trPr>
+        <w:tc>
+          <w:tcPr>
+            <w:tcW w:type="dxa" w:w="3221"/>
+            <w:vAlign w:val="center"/>
+          </w:tcPr>
+          <w:p>
+            <w:pPr>
+              <w:spacing w:after="100" w:before="100"/>
+            </w:pPr>
+            <w:r>
+              <w:rPr>
+                <w:sz w:val="19"/>
+              </w:rPr>
+              <w:t>Release</w:t>
+            </w:r>
+          </w:p>
+        </w:tc>
+        <w:tc>
+          <w:tcPr>
+            <w:tcW w:type="dxa" w:w="3221"/>
+            <w:vAlign w:val="center"/>
+          </w:tcPr>
+          <w:p>
+            <w:pPr>
+              <w:spacing w:after="100" w:before="100"/>
+            </w:pPr>
+            <w:r>
+              <w:rPr>
+                <w:sz w:val="19"/>
+              </w:rPr>
+              <w:t>No authorisation recorded.</w:t>
+            </w:r>
+          </w:p>
+        </w:tc>
+        <w:tc>
+          <w:tcPr>
+            <w:tcW w:type="dxa" w:w="3221"/>
+            <w:vAlign w:val="center"/>
+          </w:tcPr>
+          <w:p>
+            <w:pPr>
+              <w:spacing w:after="100" w:before="100"/>
+            </w:pPr>
+            <w:r>
+              <w:rPr>
+                <w:sz w:val="19"/>
+              </w:rPr>
+              <w:t>Do not publish or send either document without separate explicit authorisation.</w:t>
+            </w:r>
+          </w:p>
+        </w:tc>
+      </w:tr>
+    </w:tbl>
+    <w:p>
+      <w:pPr>
+        <w:spacing w:after="0"/>
+      </w:pPr>
     </w:p>
     <w:p>
       <w:pPr>
@@ -1811,7 +2240,7 @@
     </w:p>
     <w:p>
       <w:r>
-        <w:t>Decision: retain; factual confirmation required</w:t>
+        <w:t>Decision: retain; owner-approved indicative beta pricing</w:t>
       </w:r>
     </w:p>
     <w:p>
@@ -1880,12 +2309,12 @@
     </w:p>
     <w:p>
       <w:r>
-        <w:t>The indicative beta pricing is £4,000 a year for In-House, including one Premium project, and £5,000 a year for Agency, including three Premium projects. Quarterly billing has a higher annual total: £4,600 for In-House and £5,750 for Agency. All prices exclude VAT.</w:t>
-      </w:r>
-    </w:p>
-    <w:p>
-      <w:r>
-        <w:t>Additional projects are £500, £650 or £800 per project per year, depending on the monthly action allowance. Section 9 sets out the supplied terms in full. Prices, inclusions and beta terms remain subject to owner confirmation and the agreed order.</w:t>
+        <w:t>The owner-approved indicative beta pricing is £4,000 a year for In-House, including one Premium project, and £5,000 a year for Agency, including three Premium projects. Quarterly billing has a higher annual total: £4,600 for In-House and £5,750 for Agency. All prices exclude VAT.</w:t>
+      </w:r>
+    </w:p>
+    <w:p>
+      <w:r>
+        <w:t>Additional projects are £500, £650 or £800 per project per year, depending on the monthly action allowance. Section 9 sets out the approved figures in full. Action-counting rules, support commitments and the agreed order still apply.</w:t>
       </w:r>
     </w:p>
     <w:p>
@@ -1898,7 +2327,7 @@
     </w:p>
     <w:p>
       <w:r>
-        <w:t>Keep source annual prices and allowances, with the complete table in section 9. Remove 'no hidden costs', which requires a complete approved commercial schedule. Do not silently revise beta prices.</w:t>
+        <w:t>Owner approved the published figures as indicative beta pricing on 18 September 2026. Keep the complete table in section 9. Remove 'no hidden costs', which still requires a complete approved commercial schedule.</w:t>
       </w:r>
     </w:p>
     <w:p>
@@ -5444,7 +5873,7 @@
     </w:p>
     <w:p>
       <w:r>
-        <w:t>Decision: retain; factual confirmation required</w:t>
+        <w:t>Decision: retain; owner-approved with explicit open terms</w:t>
       </w:r>
     </w:p>
     <w:p>
@@ -5489,12 +5918,17 @@
     </w:p>
     <w:p>
       <w:r>
-        <w:t>The proposed beta offer is a two-month free trial in exchange for structured feedback, followed by a 30% reduction on the first year. The supplied schedule opens on 5 October 2026 and runs to December 2026, with webinars and how-to guides from early October.</w:t>
-      </w:r>
-    </w:p>
-    <w:p>
-      <w:r>
-        <w:t>These dates, eligibility and discount terms require owner confirmation. The source expresses an expectation that participants continue afterwards; any renewal, payment, cancellation or conversion obligation must be set out in the agreed trial terms rather than inferred from that expectation.</w:t>
+        <w:t>The owner-approved beta offer is a 60-day free trial in exchange for structured feedback. The programme opens on 5 October 2026 and runs to December 2026, with webinars and how-to guides from early October.</w:t>
+      </w:r>
+    </w:p>
+    <w:p>
+      <w:r>
+        <w:t>After the trial, customers who proceed pay each scheduled bill in full. During the first 12 months, 30% of each payment is refunded to the customer's payment method. Quarterly payments receive quarterly refunds; annual payments receive an annual refund.</w:t>
+      </w:r>
+    </w:p>
+    <w:p>
+      <w:r>
+        <w:t>Eligibility, when the 60-day period starts, refund processing time, tax treatment, treatment of additional projects, cancellation and renewal terms must be confirmed in the agreed trial and order terms. There is no automatic-conversion commitment in this Q&amp;A.</w:t>
       </w:r>
     </w:p>
     <w:p>
@@ -5507,7 +5941,7 @@
     </w:p>
     <w:p>
       <w:r>
-        <w:t>Preserve all supplied beta financial and dated participation terms for owner confirmation, not as an approved offer. Distinguish expectation of continuation from a contractual obligation; do not invent cancellation or conversion mechanics.</w:t>
+        <w:t>Record the owner's 18 September 2026 decisions: 60-day trial, structured feedback and payment-aligned 30% refunds during the first 12 months. Keep unresolved operational and contract terms explicit.</w:t>
       </w:r>
     </w:p>
     <w:p>
@@ -5520,7 +5954,7 @@
     </w:p>
     <w:p>
       <w:r>
-        <w:t>Decision: retain; factual confirmation required</w:t>
+        <w:t>Decision: retain; owner-approved indicative beta pricing</w:t>
       </w:r>
     </w:p>
     <w:p>
@@ -5817,7 +6251,7 @@
     </w:p>
     <w:p>
       <w:r>
-        <w:t>The following are the supplied indicative beta terms, subject to owner confirmation and the agreed order. All prices exclude VAT. Subscriptions are annual; payments are handled through Stripe. Monthly figures are rounded equivalents from the source, not a monthly subscription option.</w:t>
+        <w:t>The following indicative beta figures were approved by Spencer Gallagher on 18 September 2026 and match the published pricing page checked on that date. All prices exclude VAT. Subscriptions are annual; payments are handled through Stripe. Monthly figures are rounded equivalents, not a monthly subscription option. The agreed order controls the final terms.</w:t>
       </w:r>
     </w:p>
     <w:tbl>
@@ -6087,7 +6521,7 @@
     </w:p>
     <w:p>
       <w:r>
-        <w:t>In-House includes email support. Agency adds multi-client working, an agency dashboard, client sub-accounts and reporting, and priority email and chat support. Confirm the current scope of each module, support arrangements and any additional charges in the order. Proposed features are not included as current capabilities merely because the plan includes the standard platform.</w:t>
+        <w:t>In-House includes email support. Agency adds multi-client working, an agency dashboard, client sub-accounts and reporting, and priority email and chat support. Confirm support arrangements and any additional charges in the order. Proposed features are not included as current capabilities merely because the plan includes the standard platform.</w:t>
       </w:r>
     </w:p>
     <w:p>
@@ -6100,7 +6534,7 @@
     </w:p>
     <w:p>
       <w:r>
-        <w:t>Transcribe source figures without changing prices or inventing monthly subscriptions. Monthly numbers are the source's rounded equivalents, not instalments. Quarterly column is annual total. Preserve inclusions/support subject to approval; remove 'no hidden costs'.</w:t>
+        <w:t>Owner approved the published figures as indicative beta pricing on 18 September 2026. Monthly numbers are rounded equivalents, not instalments. Quarterly column is annual total. Preserve open support and order terms; remove 'no hidden costs'.</w:t>
       </w:r>
     </w:p>
     <w:p>
@@ -7492,7 +7926,7 @@
               <w:rPr>
                 <w:sz w:val="19"/>
               </w:rPr>
-              <w:t>Name / date / evidence / decision</w:t>
+              <w:t>Spencer Gallagher | 18 September 2026 | approved with explicit open terms</w:t>
             </w:r>
           </w:p>
         </w:tc>
@@ -7531,7 +7965,7 @@
               <w:rPr>
                 <w:sz w:val="19"/>
               </w:rPr>
-              <w:t>Name / date / evidence / decision</w:t>
+              <w:t>Spencer Gallagher | 18 September 2026 | qualified wording approved</w:t>
             </w:r>
           </w:p>
         </w:tc>
@@ -7570,7 +8004,7 @@
               <w:rPr>
                 <w:sz w:val="19"/>
               </w:rPr>
-              <w:t>Name / date / evidence / decision</w:t>
+              <w:t>Not approved | limitations retained</w:t>
             </w:r>
           </w:p>
         </w:tc>
@@ -7609,7 +8043,7 @@
               <w:rPr>
                 <w:sz w:val="19"/>
               </w:rPr>
-              <w:t>Approver / date / approved version / intended audience</w:t>
+              <w:t>Not authorised | do not publish or send</w:t>
             </w:r>
           </w:p>
         </w:tc>

</xml_diff>